<commit_message>
test(e2e): reduce espaciado y tamano de imagenes en el informe E2E
Menos espacio antes/despues de titulos, parrafos, tablas e imagenes;
las capturas pasan de 620 a 460pt de ancho para que quepan mejor sin
dominar la pagina. Portada mas compacta. El resultado es un informe
mas denso y continuo, apropiado para un documento de evidencia en vez
de una presentacion.

Co-Authored-By: Claude Sonnet 5 <noreply@anthropic.com>
</commit_message>
<xml_diff>
--- a/pruebas-e2e/INFORME-PRUEBAS-E2E.docx
+++ b/pruebas-e2e/INFORME-PRUEBAS-E2E.docx
@@ -4,7 +4,7 @@
   <w:body>
     <w:p>
       <w:pPr>
-        <w:spacing w:after="120" w:line="300"/>
+        <w:spacing w:after="120" w:line="260"/>
         <w:jc w:val="center"/>
       </w:pPr>
       <w:r>
@@ -19,7 +19,7 @@
     </w:p>
     <w:p>
       <w:pPr>
-        <w:spacing w:after="120" w:line="300"/>
+        <w:spacing w:after="120" w:line="260"/>
         <w:jc w:val="center"/>
       </w:pPr>
       <w:r>
@@ -34,7 +34,7 @@
     </w:p>
     <w:p>
       <w:pPr>
-        <w:spacing w:after="120" w:line="300"/>
+        <w:spacing w:after="120" w:line="260"/>
         <w:jc w:val="center"/>
       </w:pPr>
       <w:r>
@@ -49,7 +49,7 @@
     </w:p>
     <w:p>
       <w:pPr>
-        <w:spacing w:after="180"/>
+        <w:spacing w:after="100"/>
       </w:pPr>
     </w:p>
     <w:p>
@@ -60,7 +60,7 @@
       <w:r>
         <w:drawing>
           <wp:inline distT="0" distB="0" distL="0" distR="0">
-            <wp:extent cx="1333500" cy="1781175"/>
+            <wp:extent cx="1143000" cy="1533525"/>
             <wp:effectExtent t="0" r="0" b="0" l="0"/>
             <wp:docPr id="1" name="" descr="" title=""/>
             <wp:cNvGraphicFramePr>
@@ -85,7 +85,7 @@
                   <pic:spPr bwMode="auto">
                     <a:xfrm>
                       <a:off x="0" y="0"/>
-                      <a:ext cx="1333500" cy="1781175"/>
+                      <a:ext cx="1143000" cy="1533525"/>
                     </a:xfrm>
                     <a:prstGeom prst="rect">
                       <a:avLst/>
@@ -100,12 +100,12 @@
     </w:p>
     <w:p>
       <w:pPr>
-        <w:spacing w:after="180"/>
-      </w:pPr>
-    </w:p>
-    <w:p>
-      <w:pPr>
-        <w:spacing w:after="120" w:line="300"/>
+        <w:spacing w:after="100"/>
+      </w:pPr>
+    </w:p>
+    <w:p>
+      <w:pPr>
+        <w:spacing w:after="120" w:line="260"/>
         <w:jc w:val="center"/>
       </w:pPr>
       <w:r>
@@ -120,12 +120,12 @@
     </w:p>
     <w:p>
       <w:pPr>
-        <w:spacing w:after="80"/>
-      </w:pPr>
-    </w:p>
-    <w:p>
-      <w:pPr>
-        <w:spacing w:after="120" w:line="300"/>
+        <w:spacing w:after="60"/>
+      </w:pPr>
+    </w:p>
+    <w:p>
+      <w:pPr>
+        <w:spacing w:after="120" w:line="260"/>
         <w:jc w:val="center"/>
       </w:pPr>
       <w:r>
@@ -140,12 +140,12 @@
     </w:p>
     <w:p>
       <w:pPr>
-        <w:spacing w:after="360"/>
-      </w:pPr>
-    </w:p>
-    <w:p>
-      <w:pPr>
-        <w:spacing w:after="40" w:line="300"/>
+        <w:spacing w:after="160"/>
+      </w:pPr>
+    </w:p>
+    <w:p>
+      <w:pPr>
+        <w:spacing w:after="40" w:line="260"/>
         <w:jc w:val="right"/>
       </w:pPr>
       <w:r>
@@ -167,12 +167,12 @@
     </w:p>
     <w:p>
       <w:pPr>
-        <w:spacing w:after="60"/>
-      </w:pPr>
-    </w:p>
-    <w:p>
-      <w:pPr>
-        <w:spacing w:after="40" w:line="300"/>
+        <w:spacing w:after="30"/>
+      </w:pPr>
+    </w:p>
+    <w:p>
+      <w:pPr>
+        <w:spacing w:after="40" w:line="260"/>
         <w:jc w:val="right"/>
       </w:pPr>
       <w:r>
@@ -194,12 +194,12 @@
     </w:p>
     <w:p>
       <w:pPr>
-        <w:spacing w:after="60"/>
-      </w:pPr>
-    </w:p>
-    <w:p>
-      <w:pPr>
-        <w:spacing w:after="40" w:line="300"/>
+        <w:spacing w:after="30"/>
+      </w:pPr>
+    </w:p>
+    <w:p>
+      <w:pPr>
+        <w:spacing w:after="40" w:line="260"/>
         <w:jc w:val="right"/>
       </w:pPr>
       <w:r>
@@ -221,12 +221,12 @@
     </w:p>
     <w:p>
       <w:pPr>
-        <w:spacing w:after="400"/>
-      </w:pPr>
-    </w:p>
-    <w:p>
-      <w:pPr>
-        <w:spacing w:after="120" w:line="300"/>
+        <w:spacing w:after="160"/>
+      </w:pPr>
+    </w:p>
+    <w:p>
+      <w:pPr>
+        <w:spacing w:after="120" w:line="260"/>
         <w:jc w:val="center"/>
       </w:pPr>
       <w:r>
@@ -239,7 +239,7 @@
     </w:p>
     <w:p>
       <w:pPr>
-        <w:spacing w:after="120" w:line="300"/>
+        <w:spacing w:after="120" w:line="260"/>
         <w:jc w:val="center"/>
       </w:pPr>
       <w:r>
@@ -258,7 +258,7 @@
     <w:p>
       <w:pPr>
         <w:pStyle w:val="Heading1"/>
-        <w:spacing w:after="120" w:before="200" w:line="300"/>
+        <w:spacing w:after="60" w:before="80" w:line="260"/>
       </w:pPr>
       <w:r>
         <w:t xml:space="preserve">Informe de Pruebas End-to-End — SITRAM</w:t>
@@ -269,7 +269,7 @@
         <w:pBdr>
           <w:left w:val="single" w:color="9CC3E0" w:sz="12" w:space="8"/>
         </w:pBdr>
-        <w:spacing w:after="160" w:line="300"/>
+        <w:spacing w:after="80" w:line="260"/>
         <w:ind w:left="720"/>
       </w:pPr>
       <w:r>
@@ -328,7 +328,7 @@
     </w:p>
     <w:p>
       <w:pPr>
-        <w:spacing w:after="160" w:line="300"/>
+        <w:spacing w:after="80" w:line="260"/>
         <w:jc w:val="both"/>
       </w:pPr>
       <w:r>
@@ -391,8 +391,7 @@
     <w:p>
       <w:pPr>
         <w:pStyle w:val="Heading2"/>
-        <w:pageBreakBefore/>
-        <w:spacing w:after="120" w:before="200" w:line="300"/>
+        <w:spacing w:after="60" w:before="80" w:line="260"/>
       </w:pPr>
       <w:r>
         <w:t xml:space="preserve">1. Alcance</w:t>
@@ -400,7 +399,7 @@
     </w:p>
     <w:p>
       <w:pPr>
-        <w:spacing w:after="160" w:line="300"/>
+        <w:spacing w:after="80" w:line="260"/>
         <w:jc w:val="both"/>
       </w:pPr>
       <w:r>
@@ -428,7 +427,7 @@
     </w:p>
     <w:p>
       <w:pPr>
-        <w:spacing w:after="160" w:line="300"/>
+        <w:spacing w:after="80" w:line="260"/>
         <w:jc w:val="both"/>
       </w:pPr>
       <w:r>
@@ -458,8 +457,7 @@
     <w:p>
       <w:pPr>
         <w:pStyle w:val="Heading2"/>
-        <w:pageBreakBefore/>
-        <w:spacing w:after="120" w:before="200" w:line="300"/>
+        <w:spacing w:after="60" w:before="80" w:line="260"/>
       </w:pPr>
       <w:r>
         <w:t xml:space="preserve">2. Resumen de resultados</w:t>
@@ -1529,12 +1527,12 @@
     </w:tbl>
     <w:p>
       <w:pPr>
-        <w:spacing w:after="160"/>
-      </w:pPr>
-    </w:p>
-    <w:p>
-      <w:pPr>
-        <w:spacing w:after="160" w:line="300"/>
+        <w:spacing w:after="100"/>
+      </w:pPr>
+    </w:p>
+    <w:p>
+      <w:pPr>
+        <w:spacing w:after="80" w:line="260"/>
         <w:jc w:val="both"/>
       </w:pPr>
       <w:r>
@@ -1551,8 +1549,7 @@
     <w:p>
       <w:pPr>
         <w:pStyle w:val="Heading2"/>
-        <w:pageBreakBefore/>
-        <w:spacing w:after="120" w:before="200" w:line="300"/>
+        <w:spacing w:after="60" w:before="80" w:line="260"/>
       </w:pPr>
       <w:r>
         <w:t xml:space="preserve">3. Detalle de cada caso, con evidencia</w:t>
@@ -1561,7 +1558,7 @@
     <w:p>
       <w:pPr>
         <w:pStyle w:val="Heading3"/>
-        <w:spacing w:after="120" w:before="200" w:line="300"/>
+        <w:spacing w:after="60" w:before="120" w:line="260"/>
       </w:pPr>
       <w:r>
         <w:t xml:space="preserve">TC-01 — Registro de ciudadano (RF-001)</w:t>
@@ -1569,7 +1566,7 @@
     </w:p>
     <w:p>
       <w:pPr>
-        <w:spacing w:after="160" w:line="300"/>
+        <w:spacing w:after="80" w:line="260"/>
         <w:jc w:val="both"/>
       </w:pPr>
       <w:r>
@@ -1594,7 +1591,7 @@
     </w:p>
     <w:p>
       <w:pPr>
-        <w:spacing w:after="160" w:line="300"/>
+        <w:spacing w:after="80" w:line="260"/>
         <w:jc w:val="both"/>
       </w:pPr>
       <w:r>
@@ -1619,7 +1616,7 @@
     </w:p>
     <w:p>
       <w:pPr>
-        <w:spacing w:after="160" w:line="300"/>
+        <w:spacing w:after="80" w:line="260"/>
         <w:jc w:val="both"/>
       </w:pPr>
       <w:r>
@@ -1644,13 +1641,13 @@
     </w:p>
     <w:p>
       <w:pPr>
-        <w:spacing w:after="160" w:line="240"/>
+        <w:spacing w:after="80" w:line="240"/>
         <w:jc w:val="center"/>
       </w:pPr>
       <w:r>
         <w:drawing>
           <wp:inline distT="0" distB="0" distL="0" distR="0">
-            <wp:extent cx="5905500" cy="4152900"/>
+            <wp:extent cx="4381500" cy="3076575"/>
             <wp:effectExtent t="0" r="0" b="0" l="0"/>
             <wp:docPr id="1" name="" descr="" title=""/>
             <wp:cNvGraphicFramePr>
@@ -1675,7 +1672,7 @@
                   <pic:spPr bwMode="auto">
                     <a:xfrm>
                       <a:off x="0" y="0"/>
-                      <a:ext cx="5905500" cy="4152900"/>
+                      <a:ext cx="4381500" cy="3076575"/>
                     </a:xfrm>
                     <a:prstGeom prst="rect">
                       <a:avLst/>
@@ -1691,7 +1688,7 @@
     <w:p>
       <w:pPr>
         <w:pStyle w:val="Heading3"/>
-        <w:spacing w:after="120" w:before="200" w:line="300"/>
+        <w:spacing w:after="60" w:before="120" w:line="260"/>
       </w:pPr>
       <w:r>
         <w:t xml:space="preserve">TC-02 — Confirmación de correo y fijación de contraseña (RF-001)</w:t>
@@ -1699,7 +1696,7 @@
     </w:p>
     <w:p>
       <w:pPr>
-        <w:spacing w:after="160" w:line="300"/>
+        <w:spacing w:after="80" w:line="260"/>
         <w:jc w:val="both"/>
       </w:pPr>
       <w:r>
@@ -1742,7 +1739,7 @@
     </w:p>
     <w:p>
       <w:pPr>
-        <w:spacing w:after="160" w:line="300"/>
+        <w:spacing w:after="80" w:line="260"/>
         <w:jc w:val="both"/>
       </w:pPr>
       <w:r>
@@ -1758,7 +1755,7 @@
     </w:p>
     <w:p>
       <w:pPr>
-        <w:spacing w:after="160" w:line="300"/>
+        <w:spacing w:after="80" w:line="260"/>
         <w:jc w:val="both"/>
       </w:pPr>
       <w:r>
@@ -1774,13 +1771,13 @@
     </w:p>
     <w:p>
       <w:pPr>
-        <w:spacing w:after="160" w:line="240"/>
+        <w:spacing w:after="80" w:line="240"/>
         <w:jc w:val="center"/>
       </w:pPr>
       <w:r>
         <w:drawing>
           <wp:inline distT="0" distB="0" distL="0" distR="0">
-            <wp:extent cx="5905500" cy="4152900"/>
+            <wp:extent cx="4381500" cy="3076575"/>
             <wp:effectExtent t="0" r="0" b="0" l="0"/>
             <wp:docPr id="1" name="" descr="" title=""/>
             <wp:cNvGraphicFramePr>
@@ -1805,7 +1802,7 @@
                   <pic:spPr bwMode="auto">
                     <a:xfrm>
                       <a:off x="0" y="0"/>
-                      <a:ext cx="5905500" cy="4152900"/>
+                      <a:ext cx="4381500" cy="3076575"/>
                     </a:xfrm>
                     <a:prstGeom prst="rect">
                       <a:avLst/>
@@ -1823,7 +1820,7 @@
         <w:pBdr>
           <w:left w:val="single" w:color="9CC3E0" w:sz="12" w:space="8"/>
         </w:pBdr>
-        <w:spacing w:after="160" w:line="300"/>
+        <w:spacing w:after="80" w:line="260"/>
         <w:ind w:left="720"/>
       </w:pPr>
       <w:r>
@@ -1876,7 +1873,7 @@
     <w:p>
       <w:pPr>
         <w:pStyle w:val="Heading3"/>
-        <w:spacing w:after="120" w:before="200" w:line="300"/>
+        <w:spacing w:after="60" w:before="120" w:line="260"/>
       </w:pPr>
       <w:r>
         <w:t xml:space="preserve">TC-03 — Inicio de sesión de ciudadano (RF-002)</w:t>
@@ -1884,7 +1881,7 @@
     </w:p>
     <w:p>
       <w:pPr>
-        <w:spacing w:after="160" w:line="300"/>
+        <w:spacing w:after="80" w:line="260"/>
         <w:jc w:val="both"/>
       </w:pPr>
       <w:r>
@@ -1900,7 +1897,7 @@
     </w:p>
     <w:p>
       <w:pPr>
-        <w:spacing w:after="160" w:line="300"/>
+        <w:spacing w:after="80" w:line="260"/>
         <w:jc w:val="both"/>
       </w:pPr>
       <w:r>
@@ -1925,7 +1922,7 @@
     </w:p>
     <w:p>
       <w:pPr>
-        <w:spacing w:after="160" w:line="300"/>
+        <w:spacing w:after="80" w:line="260"/>
         <w:jc w:val="both"/>
       </w:pPr>
       <w:r>
@@ -1941,13 +1938,13 @@
     </w:p>
     <w:p>
       <w:pPr>
-        <w:spacing w:after="160" w:line="240"/>
+        <w:spacing w:after="80" w:line="240"/>
         <w:jc w:val="center"/>
       </w:pPr>
       <w:r>
         <w:drawing>
           <wp:inline distT="0" distB="0" distL="0" distR="0">
-            <wp:extent cx="5905500" cy="4152900"/>
+            <wp:extent cx="4381500" cy="3076575"/>
             <wp:effectExtent t="0" r="0" b="0" l="0"/>
             <wp:docPr id="1" name="" descr="" title=""/>
             <wp:cNvGraphicFramePr>
@@ -1972,7 +1969,7 @@
                   <pic:spPr bwMode="auto">
                     <a:xfrm>
                       <a:off x="0" y="0"/>
-                      <a:ext cx="5905500" cy="4152900"/>
+                      <a:ext cx="4381500" cy="3076575"/>
                     </a:xfrm>
                     <a:prstGeom prst="rect">
                       <a:avLst/>
@@ -1988,7 +1985,7 @@
     <w:p>
       <w:pPr>
         <w:pStyle w:val="Heading3"/>
-        <w:spacing w:after="120" w:before="200" w:line="300"/>
+        <w:spacing w:after="60" w:before="120" w:line="260"/>
       </w:pPr>
       <w:r>
         <w:t xml:space="preserve">TC-04 — Iniciar un trámite desde el catálogo (RF-020)</w:t>
@@ -1996,7 +1993,7 @@
     </w:p>
     <w:p>
       <w:pPr>
-        <w:spacing w:after="160" w:line="300"/>
+        <w:spacing w:after="80" w:line="260"/>
         <w:jc w:val="both"/>
       </w:pPr>
       <w:r>
@@ -2021,7 +2018,7 @@
     </w:p>
     <w:p>
       <w:pPr>
-        <w:spacing w:after="160" w:line="300"/>
+        <w:spacing w:after="80" w:line="260"/>
         <w:jc w:val="both"/>
       </w:pPr>
       <w:r>
@@ -2046,7 +2043,7 @@
     </w:p>
     <w:p>
       <w:pPr>
-        <w:spacing w:after="160" w:line="300"/>
+        <w:spacing w:after="80" w:line="260"/>
         <w:jc w:val="both"/>
       </w:pPr>
       <w:r>
@@ -2071,13 +2068,13 @@
     </w:p>
     <w:p>
       <w:pPr>
-        <w:spacing w:after="160" w:line="240"/>
+        <w:spacing w:after="80" w:line="240"/>
         <w:jc w:val="center"/>
       </w:pPr>
       <w:r>
         <w:drawing>
           <wp:inline distT="0" distB="0" distL="0" distR="0">
-            <wp:extent cx="5905500" cy="4152900"/>
+            <wp:extent cx="4381500" cy="3076575"/>
             <wp:effectExtent t="0" r="0" b="0" l="0"/>
             <wp:docPr id="1" name="" descr="" title=""/>
             <wp:cNvGraphicFramePr>
@@ -2102,7 +2099,7 @@
                   <pic:spPr bwMode="auto">
                     <a:xfrm>
                       <a:off x="0" y="0"/>
-                      <a:ext cx="5905500" cy="4152900"/>
+                      <a:ext cx="4381500" cy="3076575"/>
                     </a:xfrm>
                     <a:prstGeom prst="rect">
                       <a:avLst/>
@@ -2118,7 +2115,7 @@
     <w:p>
       <w:pPr>
         <w:pStyle w:val="Heading3"/>
-        <w:spacing w:after="120" w:before="200" w:line="300"/>
+        <w:spacing w:after="60" w:before="120" w:line="260"/>
       </w:pPr>
       <w:r>
         <w:t xml:space="preserve">TC-05 — Consultar el estado del trámite (RF-050)</w:t>
@@ -2126,7 +2123,7 @@
     </w:p>
     <w:p>
       <w:pPr>
-        <w:spacing w:after="160" w:line="300"/>
+        <w:spacing w:after="80" w:line="260"/>
         <w:jc w:val="both"/>
       </w:pPr>
       <w:r>
@@ -2142,7 +2139,7 @@
     </w:p>
     <w:p>
       <w:pPr>
-        <w:spacing w:after="160" w:line="300"/>
+        <w:spacing w:after="80" w:line="260"/>
         <w:jc w:val="both"/>
       </w:pPr>
       <w:r>
@@ -2167,7 +2164,7 @@
     </w:p>
     <w:p>
       <w:pPr>
-        <w:spacing w:after="160" w:line="300"/>
+        <w:spacing w:after="80" w:line="260"/>
         <w:jc w:val="both"/>
       </w:pPr>
       <w:r>
@@ -2183,13 +2180,13 @@
     </w:p>
     <w:p>
       <w:pPr>
-        <w:spacing w:after="160" w:line="240"/>
+        <w:spacing w:after="80" w:line="240"/>
         <w:jc w:val="center"/>
       </w:pPr>
       <w:r>
         <w:drawing>
           <wp:inline distT="0" distB="0" distL="0" distR="0">
-            <wp:extent cx="5905500" cy="4152900"/>
+            <wp:extent cx="4381500" cy="3076575"/>
             <wp:effectExtent t="0" r="0" b="0" l="0"/>
             <wp:docPr id="1" name="" descr="" title=""/>
             <wp:cNvGraphicFramePr>
@@ -2214,7 +2211,7 @@
                   <pic:spPr bwMode="auto">
                     <a:xfrm>
                       <a:off x="0" y="0"/>
-                      <a:ext cx="5905500" cy="4152900"/>
+                      <a:ext cx="4381500" cy="3076575"/>
                     </a:xfrm>
                     <a:prstGeom prst="rect">
                       <a:avLst/>
@@ -2230,7 +2227,7 @@
     <w:p>
       <w:pPr>
         <w:pStyle w:val="Heading3"/>
-        <w:spacing w:after="120" w:before="200" w:line="300"/>
+        <w:spacing w:after="60" w:before="120" w:line="260"/>
       </w:pPr>
       <w:r>
         <w:t xml:space="preserve">TC-06 — Inicio de sesión de administrador (RF-002)</w:t>
@@ -2238,7 +2235,7 @@
     </w:p>
     <w:p>
       <w:pPr>
-        <w:spacing w:after="160" w:line="300"/>
+        <w:spacing w:after="80" w:line="260"/>
         <w:jc w:val="both"/>
       </w:pPr>
       <w:r>
@@ -2263,7 +2260,7 @@
     </w:p>
     <w:p>
       <w:pPr>
-        <w:spacing w:after="160" w:line="300"/>
+        <w:spacing w:after="80" w:line="260"/>
         <w:jc w:val="both"/>
       </w:pPr>
       <w:r>
@@ -2279,7 +2276,7 @@
     </w:p>
     <w:p>
       <w:pPr>
-        <w:spacing w:after="160" w:line="300"/>
+        <w:spacing w:after="80" w:line="260"/>
         <w:jc w:val="both"/>
       </w:pPr>
       <w:r>
@@ -2295,13 +2292,13 @@
     </w:p>
     <w:p>
       <w:pPr>
-        <w:spacing w:after="160" w:line="240"/>
+        <w:spacing w:after="80" w:line="240"/>
         <w:jc w:val="center"/>
       </w:pPr>
       <w:r>
         <w:drawing>
           <wp:inline distT="0" distB="0" distL="0" distR="0">
-            <wp:extent cx="5905500" cy="4152900"/>
+            <wp:extent cx="4381500" cy="3076575"/>
             <wp:effectExtent t="0" r="0" b="0" l="0"/>
             <wp:docPr id="1" name="" descr="" title=""/>
             <wp:cNvGraphicFramePr>
@@ -2326,7 +2323,7 @@
                   <pic:spPr bwMode="auto">
                     <a:xfrm>
                       <a:off x="0" y="0"/>
-                      <a:ext cx="5905500" cy="4152900"/>
+                      <a:ext cx="4381500" cy="3076575"/>
                     </a:xfrm>
                     <a:prstGeom prst="rect">
                       <a:avLst/>
@@ -2342,7 +2339,7 @@
     <w:p>
       <w:pPr>
         <w:pStyle w:val="Heading3"/>
-        <w:spacing w:after="120" w:before="200" w:line="300"/>
+        <w:spacing w:after="60" w:before="120" w:line="260"/>
       </w:pPr>
       <w:r>
         <w:t xml:space="preserve">TC-07 — Administrar catálogo de trámites / TUPA (RF-010)</w:t>
@@ -2350,7 +2347,7 @@
     </w:p>
     <w:p>
       <w:pPr>
-        <w:spacing w:after="160" w:line="300"/>
+        <w:spacing w:after="80" w:line="260"/>
         <w:jc w:val="both"/>
       </w:pPr>
       <w:r>
@@ -2375,7 +2372,7 @@
     </w:p>
     <w:p>
       <w:pPr>
-        <w:spacing w:after="160" w:line="300"/>
+        <w:spacing w:after="80" w:line="260"/>
         <w:jc w:val="both"/>
       </w:pPr>
       <w:r>
@@ -2400,7 +2397,7 @@
     </w:p>
     <w:p>
       <w:pPr>
-        <w:spacing w:after="160" w:line="300"/>
+        <w:spacing w:after="80" w:line="260"/>
         <w:jc w:val="both"/>
       </w:pPr>
       <w:r>
@@ -2416,13 +2413,13 @@
     </w:p>
     <w:p>
       <w:pPr>
-        <w:spacing w:after="160" w:line="240"/>
+        <w:spacing w:after="80" w:line="240"/>
         <w:jc w:val="center"/>
       </w:pPr>
       <w:r>
         <w:drawing>
           <wp:inline distT="0" distB="0" distL="0" distR="0">
-            <wp:extent cx="5905500" cy="4152900"/>
+            <wp:extent cx="4381500" cy="3076575"/>
             <wp:effectExtent t="0" r="0" b="0" l="0"/>
             <wp:docPr id="1" name="" descr="" title=""/>
             <wp:cNvGraphicFramePr>
@@ -2447,7 +2444,7 @@
                   <pic:spPr bwMode="auto">
                     <a:xfrm>
                       <a:off x="0" y="0"/>
-                      <a:ext cx="5905500" cy="4152900"/>
+                      <a:ext cx="4381500" cy="3076575"/>
                     </a:xfrm>
                     <a:prstGeom prst="rect">
                       <a:avLst/>
@@ -2463,7 +2460,7 @@
     <w:p>
       <w:pPr>
         <w:pStyle w:val="Heading3"/>
-        <w:spacing w:after="120" w:before="200" w:line="300"/>
+        <w:spacing w:after="60" w:before="120" w:line="260"/>
       </w:pPr>
       <w:r>
         <w:t xml:space="preserve">TC-08 — Crear cuenta de funcionario con rol (RF-006)</w:t>
@@ -2471,7 +2468,7 @@
     </w:p>
     <w:p>
       <w:pPr>
-        <w:spacing w:after="160" w:line="300"/>
+        <w:spacing w:after="80" w:line="260"/>
         <w:jc w:val="both"/>
       </w:pPr>
       <w:r>
@@ -2505,7 +2502,7 @@
     </w:p>
     <w:p>
       <w:pPr>
-        <w:spacing w:after="160" w:line="300"/>
+        <w:spacing w:after="80" w:line="260"/>
         <w:jc w:val="both"/>
       </w:pPr>
       <w:r>
@@ -2521,7 +2518,7 @@
     </w:p>
     <w:p>
       <w:pPr>
-        <w:spacing w:after="160" w:line="300"/>
+        <w:spacing w:after="80" w:line="260"/>
         <w:jc w:val="both"/>
       </w:pPr>
       <w:r>
@@ -2555,13 +2552,13 @@
     </w:p>
     <w:p>
       <w:pPr>
-        <w:spacing w:after="160" w:line="240"/>
+        <w:spacing w:after="80" w:line="240"/>
         <w:jc w:val="center"/>
       </w:pPr>
       <w:r>
         <w:drawing>
           <wp:inline distT="0" distB="0" distL="0" distR="0">
-            <wp:extent cx="5905500" cy="4152900"/>
+            <wp:extent cx="4381500" cy="3076575"/>
             <wp:effectExtent t="0" r="0" b="0" l="0"/>
             <wp:docPr id="1" name="" descr="" title=""/>
             <wp:cNvGraphicFramePr>
@@ -2586,7 +2583,7 @@
                   <pic:spPr bwMode="auto">
                     <a:xfrm>
                       <a:off x="0" y="0"/>
-                      <a:ext cx="5905500" cy="4152900"/>
+                      <a:ext cx="4381500" cy="3076575"/>
                     </a:xfrm>
                     <a:prstGeom prst="rect">
                       <a:avLst/>
@@ -2602,7 +2599,7 @@
     <w:p>
       <w:pPr>
         <w:pStyle w:val="Heading3"/>
-        <w:spacing w:after="120" w:before="200" w:line="300"/>
+        <w:spacing w:after="60" w:before="120" w:line="260"/>
       </w:pPr>
       <w:r>
         <w:t xml:space="preserve">TC-09 — Control de acceso: ciudadano sin permiso de administración (RNF-005)</w:t>
@@ -2610,7 +2607,7 @@
     </w:p>
     <w:p>
       <w:pPr>
-        <w:spacing w:after="160" w:line="300"/>
+        <w:spacing w:after="80" w:line="260"/>
         <w:jc w:val="both"/>
       </w:pPr>
       <w:r>
@@ -2635,7 +2632,7 @@
     </w:p>
     <w:p>
       <w:pPr>
-        <w:spacing w:after="160" w:line="300"/>
+        <w:spacing w:after="80" w:line="260"/>
         <w:jc w:val="both"/>
       </w:pPr>
       <w:r>
@@ -2661,7 +2658,7 @@
     </w:p>
     <w:p>
       <w:pPr>
-        <w:spacing w:after="160" w:line="300"/>
+        <w:spacing w:after="80" w:line="260"/>
         <w:jc w:val="both"/>
       </w:pPr>
       <w:r>
@@ -2677,13 +2674,13 @@
     </w:p>
     <w:p>
       <w:pPr>
-        <w:spacing w:after="160" w:line="240"/>
+        <w:spacing w:after="80" w:line="240"/>
         <w:jc w:val="center"/>
       </w:pPr>
       <w:r>
         <w:drawing>
           <wp:inline distT="0" distB="0" distL="0" distR="0">
-            <wp:extent cx="5905500" cy="4152900"/>
+            <wp:extent cx="4381500" cy="3076575"/>
             <wp:effectExtent t="0" r="0" b="0" l="0"/>
             <wp:docPr id="1" name="" descr="" title=""/>
             <wp:cNvGraphicFramePr>
@@ -2708,7 +2705,7 @@
                   <pic:spPr bwMode="auto">
                     <a:xfrm>
                       <a:off x="0" y="0"/>
-                      <a:ext cx="5905500" cy="4152900"/>
+                      <a:ext cx="4381500" cy="3076575"/>
                     </a:xfrm>
                     <a:prstGeom prst="rect">
                       <a:avLst/>
@@ -2724,8 +2721,7 @@
     <w:p>
       <w:pPr>
         <w:pStyle w:val="Heading2"/>
-        <w:pageBreakBefore/>
-        <w:spacing w:after="120" w:before="200" w:line="300"/>
+        <w:spacing w:after="60" w:before="80" w:line="260"/>
       </w:pPr>
       <w:r>
         <w:t xml:space="preserve">4. Conclusión</w:t>
@@ -2733,7 +2729,7 @@
     </w:p>
     <w:p>
       <w:pPr>
-        <w:spacing w:after="160" w:line="300"/>
+        <w:spacing w:after="80" w:line="260"/>
         <w:jc w:val="both"/>
       </w:pPr>
       <w:r>
@@ -2742,7 +2738,7 @@
     </w:p>
     <w:p>
       <w:pPr>
-        <w:spacing w:after="160" w:line="300"/>
+        <w:spacing w:after="80" w:line="260"/>
         <w:jc w:val="both"/>
       </w:pPr>
       <w:r>
@@ -3254,7 +3250,7 @@
     <w:next w:val="Normal"/>
     <w:qFormat/>
     <w:pPr>
-      <w:spacing w:after="160" w:before="0" w:line="300"/>
+      <w:spacing w:after="80" w:before="0" w:line="260"/>
       <w:jc w:val="center"/>
       <w:outlineLvl w:val="0"/>
     </w:pPr>
@@ -3273,7 +3269,7 @@
     <w:next w:val="Normal"/>
     <w:qFormat/>
     <w:pPr>
-      <w:spacing w:after="120" w:before="240" w:line="300"/>
+      <w:spacing w:after="60" w:before="120" w:line="260"/>
       <w:outlineLvl w:val="1"/>
     </w:pPr>
     <w:rPr>
@@ -3291,7 +3287,7 @@
     <w:next w:val="Normal"/>
     <w:qFormat/>
     <w:pPr>
-      <w:spacing w:after="100" w:before="200" w:line="300"/>
+      <w:spacing w:after="40" w:before="100" w:line="260"/>
       <w:outlineLvl w:val="2"/>
     </w:pPr>
     <w:rPr>
@@ -3311,7 +3307,7 @@
     <w:next w:val="Normal"/>
     <w:qFormat/>
     <w:pPr>
-      <w:spacing w:after="80" w:before="160" w:line="300"/>
+      <w:spacing w:after="40" w:before="80" w:line="260"/>
       <w:ind w:firstLine="720"/>
       <w:outlineLvl w:val="3"/>
     </w:pPr>

</xml_diff>

<commit_message>
test(e2e): informe autocontenido, sin referencias al informe academico
Se quitan las menciones cruzadas a informe-02/ y docs/errores-conocidos.md:
el informe de pruebas E2E queda como evidencia primaria autosuficiente,
sin depender de otro documento del proyecto para entenderse.

Co-Authored-By: Claude Sonnet 5 <noreply@anthropic.com>
</commit_message>
<xml_diff>
--- a/pruebas-e2e/INFORME-PRUEBAS-E2E.docx
+++ b/pruebas-e2e/INFORME-PRUEBAS-E2E.docx
@@ -277,7 +277,23 @@
           <w:i/>
           <w:iCs/>
         </w:rPr>
-        <w:t xml:space="preserve">Documento independiente del informe académico principal (</w:t>
+        <w:t xml:space="preserve">Registra la ejecución de pruebas </w:t>
+      </w:r>
+      <w:r>
+        <w:rPr>
+          <w:b/>
+          <w:bCs/>
+          <w:i/>
+          <w:iCs/>
+        </w:rPr>
+        <w:t xml:space="preserve">end-to-end (E2E)</w:t>
+      </w:r>
+      <w:r>
+        <w:rPr>
+          <w:i/>
+          <w:iCs/>
+        </w:rPr>
+        <w:t xml:space="preserve">: flujos completos ejecutados en un navegador real (Chromium vía Playwright) contra el frontend Blazor (</w:t>
       </w:r>
       <w:r>
         <w:rPr>
@@ -285,44 +301,13 @@
           <w:i/>
           <w:iCs/>
         </w:rPr>
-        <w:t xml:space="preserve">informe-02/</w:t>
+        <w:t xml:space="preserve">http://localhost:5049</w:t>
       </w:r>
       <w:r>
         <w:rPr>
           <w:i/>
           <w:iCs/>
         </w:rPr>
-        <w:t xml:space="preserve">). Registra la ejecución de pruebas </w:t>
-      </w:r>
-      <w:r>
-        <w:rPr>
-          <w:b/>
-          <w:bCs/>
-          <w:i/>
-          <w:iCs/>
-        </w:rPr>
-        <w:t xml:space="preserve">end-to-end (E2E)</w:t>
-      </w:r>
-      <w:r>
-        <w:rPr>
-          <w:i/>
-          <w:iCs/>
-        </w:rPr>
-        <w:t xml:space="preserve">: flujos completos ejecutados en un navegador real (Chromium vía Playwright) contra el frontend Blazor (</w:t>
-      </w:r>
-      <w:r>
-        <w:rPr>
-          <w:rFonts w:ascii="Courier New" w:cs="Courier New" w:eastAsia="Courier New" w:hAnsi="Courier New"/>
-          <w:i/>
-          <w:iCs/>
-        </w:rPr>
-        <w:t xml:space="preserve">http://localhost:5049</w:t>
-      </w:r>
-      <w:r>
-        <w:rPr>
-          <w:i/>
-          <w:iCs/>
-        </w:rPr>
         <w:t xml:space="preserve">) y el backend real (API + PostgreSQL en Supabase), sin mocks ni simulaciones — exactamente como los usaría un usuario final.</w:t>
       </w:r>
     </w:p>
@@ -403,16 +388,7 @@
         <w:jc w:val="both"/>
       </w:pPr>
       <w:r>
-        <w:t xml:space="preserve">A diferencia de las pruebas unitarias y de integración (que ya cubren 146/146 casos a nivel de código y API, ver </w:t>
-      </w:r>
-      <w:r>
-        <w:rPr>
-          <w:rFonts w:ascii="Courier New" w:cs="Courier New" w:eastAsia="Courier New" w:hAnsi="Courier New"/>
-        </w:rPr>
-        <w:t xml:space="preserve">informe-02/06-capitulo-4.md</w:t>
-      </w:r>
-      <w:r>
-        <w:t xml:space="preserve">), estas pruebas E2E verifican la </w:t>
+        <w:t xml:space="preserve">Estas pruebas E2E verifican la </w:t>
       </w:r>
       <w:r>
         <w:rPr>
@@ -422,7 +398,7 @@
         <w:t xml:space="preserve">experiencia completa del usuario final</w:t>
       </w:r>
       <w:r>
-        <w:t xml:space="preserve"> a través de la interfaz web real: llenar formularios, hacer clic, y comprobar que la pantalla resultante sea la correcta.</w:t>
+        <w:t xml:space="preserve"> a través de la interfaz web real: llenar formularios, hacer clic, y comprobar que la pantalla resultante sea la correcta — a diferencia de una prueba unitaria o de integración, que verifica el código o la API por dentro, sin pasar por la interfaz.</w:t>
       </w:r>
     </w:p>
     <w:p>
@@ -1837,37 +1813,7 @@
           <w:i/>
           <w:iCs/>
         </w:rPr>
-        <w:t xml:space="preserve">: en este entorno de prueba había SMTP real configurado (Gmail), por lo que el enlace de verificación se envía de verdad y no queda en el log. Para automatizar la lectura del enlace sin depender de una bandeja de correo externa, se desactivó temporalmente </w:t>
-      </w:r>
-      <w:r>
-        <w:rPr>
-          <w:rFonts w:ascii="Courier New" w:cs="Courier New" w:eastAsia="Courier New" w:hAnsi="Courier New"/>
-          <w:i/>
-          <w:iCs/>
-        </w:rPr>
-        <w:t xml:space="preserve">Smtp:Host</w:t>
-      </w:r>
-      <w:r>
-        <w:rPr>
-          <w:i/>
-          <w:iCs/>
-        </w:rPr>
-        <w:t xml:space="preserve"> en los User Secrets locales (con lo que el sistema cae al comportamiento de desarrollo documentado en </w:t>
-      </w:r>
-      <w:r>
-        <w:rPr>
-          <w:rFonts w:ascii="Courier New" w:cs="Courier New" w:eastAsia="Courier New" w:hAnsi="Courier New"/>
-          <w:i/>
-          <w:iCs/>
-        </w:rPr>
-        <w:t xml:space="preserve">docs/errores-conocidos.md</w:t>
-      </w:r>
-      <w:r>
-        <w:rPr>
-          <w:i/>
-          <w:iCs/>
-        </w:rPr>
-        <w:t xml:space="preserve">: el cuerpo del correo se registra en el log del servidor) y se restauró la configuración original inmediatamente después de la corrida. No se modificó ninguna credencial.</w:t>
+        <w:t xml:space="preserve">: en este entorno de prueba había SMTP real configurado (Gmail), por lo que el enlace de verificación se envía de verdad y no queda en el log. Para automatizar la lectura del enlace sin depender de una bandeja de correo externa, se desactivó temporalmente el SMTP en la configuración local (con lo que el sistema registra el cuerpo del correo en el log del servidor en vez de enviarlo) y se restauró la configuración original inmediatamente después de la corrida. No se modificó ninguna credencial.</w:t>
       </w:r>
     </w:p>
     <w:p>
@@ -2733,7 +2679,7 @@
         <w:jc w:val="both"/>
       </w:pPr>
       <w:r>
-        <w:t xml:space="preserve">Los 9 flujos de usuario final probados end-to-end —abarcando los tres roles principales del sistema (Ciudadano, Administrador, y el caso negativo de control de acceso)— funcionan correctamente sobre el sistema real (frontend Blazor + backend + PostgreSQL), sin necesidad de mocks. Esto complementa, con evidencia visual, los resultados ya reportados en el informe principal (146/146 pruebas automatizadas de dominio, aplicación e integración).</w:t>
+        <w:t xml:space="preserve">Los 9 flujos de usuario final probados end-to-end —abarcando los tres roles principales del sistema (Ciudadano, Administrador, y el caso negativo de control de acceso)— funcionan correctamente sobre el sistema real (frontend Blazor + backend + PostgreSQL), sin necesidad de mocks ni simulaciones.</w:t>
       </w:r>
     </w:p>
     <w:p>

</xml_diff>